<commit_message>
Document the Azure OpenAI code path in the handover doc
</commit_message>
<xml_diff>
--- a/reports/Internal AI Sales Assistant - Handover.docx
+++ b/reports/Internal AI Sales Assistant - Handover.docx
@@ -5037,6 +5037,36 @@
                 <w:sz w:val="20"/>
               </w:rPr>
               <w:t>app/streamlit_app.py, bottom of the file</w:t>
+            </w:r>
+          </w:p>
+        </w:tc>
+      </w:tr>
+      <w:tr>
+        <w:tc>
+          <w:tcPr>
+            <w:tcW w:type="dxa" w:w="3744"/>
+          </w:tcPr>
+          <w:p>
+            <w:r/>
+            <w:r>
+              <w:rPr>
+                <w:sz w:val="20"/>
+              </w:rPr>
+              <w:t>Switch to Azure OpenAI (chat only)</w:t>
+            </w:r>
+          </w:p>
+        </w:tc>
+        <w:tc>
+          <w:tcPr>
+            <w:tcW w:type="dxa" w:w="5616"/>
+          </w:tcPr>
+          <w:p>
+            <w:r/>
+            <w:r>
+              <w:rPr>
+                <w:sz w:val="20"/>
+              </w:rPr>
+              <w:t>Set LLM_PROVIDER=azure_openai plus the four AZURE_OPENAI_* vars; embeddings still require OpenAI or local -- no Azure option for embeddings</w:t>
             </w:r>
           </w:p>
         </w:tc>

</xml_diff>